<commit_message>
Cite real Google Support sources for Part 1 security requirements
Adds a Source column to the Part 1 table with links to the actual
Google Support articles backing each requirement, and quotes their
wording directly instead of a fully paraphrased description. Swaps
the unsourced "generic login error" item for a sourced Configuration
Parameters Management requirement (enforced minimum TLS for mail
delivery).

Co-Authored-By: Claude Sonnet 5 <noreply@anthropic.com>
Claude-Session: https://claude.ai/code/session_01ATS6vWpy4e6bbX3UiMvZkF
</commit_message>
<xml_diff>
--- a/Homework2_Requirements.docx
+++ b/Homework2_Requirements.docx
@@ -54,7 +54,7 @@
         <w:spacing w:after="160"/>
       </w:pPr>
       <w:r>
-        <w:t xml:space="preserve">Application chosen: Gmail (a widely used web-based email application). The table below lists six security requirements I am certain exist for this application, along with the requirement type from Figure 2.2 (p. 99).</w:t>
+        <w:t xml:space="preserve">Application chosen: Gmail (a widely used web-based email application). The table below lists six security requirements I am certain exist for this application, the requirement type from Figure 2.2 (p. 99), and a link to Google's own support documentation confirming the underlying behavior (quoted where noted).</w:t>
       </w:r>
     </w:p>
     <w:tbl>
@@ -70,8 +70,9 @@
         </w:tblBorders>
       </w:tblPr>
       <w:tblGrid>
-        <w:gridCol w:w="6854"/>
-        <w:gridCol w:w="3226"/>
+        <w:gridCol w:w="5242"/>
+        <w:gridCol w:w="2016"/>
+        <w:gridCol w:w="2822"/>
       </w:tblGrid>
       <w:tr>
         <w:trPr>
@@ -79,7 +80,7 @@
         </w:trPr>
         <w:tc>
           <w:tcPr>
-            <w:tcW w:type="dxa" w:w="6854"/>
+            <w:tcW w:type="dxa" w:w="5242"/>
             <w:shd w:fill="1F4E79" w:color="auto" w:val="clear"/>
             <w:tcMar>
               <w:top w:type="dxa" w:w="100"/>
@@ -101,7 +102,7 @@
         </w:tc>
         <w:tc>
           <w:tcPr>
-            <w:tcW w:type="dxa" w:w="3226"/>
+            <w:tcW w:type="dxa" w:w="2016"/>
             <w:shd w:fill="1F4E79" w:color="auto" w:val="clear"/>
             <w:tcMar>
               <w:top w:type="dxa" w:w="100"/>
@@ -121,11 +122,33 @@
             </w:r>
           </w:p>
         </w:tc>
+        <w:tc>
+          <w:tcPr>
+            <w:tcW w:type="dxa" w:w="2822"/>
+            <w:shd w:fill="1F4E79" w:color="auto" w:val="clear"/>
+            <w:tcMar>
+              <w:top w:type="dxa" w:w="100"/>
+              <w:left w:type="dxa" w:w="120"/>
+              <w:bottom w:type="dxa" w:w="100"/>
+              <w:right w:type="dxa" w:w="120"/>
+            </w:tcMar>
+          </w:tcPr>
+          <w:p>
+            <w:r>
+              <w:rPr>
+                <w:b/>
+                <w:bCs/>
+                <w:color w:val="FFFFFF"/>
+              </w:rPr>
+              <w:t xml:space="preserve">Source</w:t>
+            </w:r>
+          </w:p>
+        </w:tc>
       </w:tr>
       <w:tr>
         <w:tc>
           <w:tcPr>
-            <w:tcW w:type="dxa" w:w="6854"/>
+            <w:tcW w:type="dxa" w:w="5242"/>
             <w:tcMar>
               <w:top w:type="dxa" w:w="100"/>
               <w:left w:type="dxa" w:w="120"/>
@@ -140,13 +163,13 @@
                 <w:bCs w:val="false"/>
                 <w:color w:val="000000"/>
               </w:rPr>
-              <w:t xml:space="preserve">Emails and attachments must be encrypted in transit using TLS 1.2 or higher between the user's browser/mail client and Gmail's servers, so message contents cannot be read by anyone intercepting the network traffic.</w:t>
-            </w:r>
-          </w:p>
-        </w:tc>
-        <w:tc>
-          <w:tcPr>
-            <w:tcW w:type="dxa" w:w="3226"/>
+              <w:t xml:space="preserve">Gmail encrypts messages in transit with TLS by default: "Gmail uses TLS by default to encrypt the connection when messages travel between email servers, which helps provide privacy and prevents eavesdropping or tampering with emails while in transit." This protects message contents from anyone intercepting the network traffic.</w:t>
+            </w:r>
+          </w:p>
+        </w:tc>
+        <w:tc>
+          <w:tcPr>
+            <w:tcW w:type="dxa" w:w="2016"/>
             <w:tcMar>
               <w:top w:type="dxa" w:w="100"/>
               <w:left w:type="dxa" w:w="120"/>
@@ -165,11 +188,34 @@
             </w:r>
           </w:p>
         </w:tc>
+        <w:tc>
+          <w:tcPr>
+            <w:tcW w:type="dxa" w:w="2822"/>
+            <w:tcMar>
+              <w:top w:type="dxa" w:w="100"/>
+              <w:left w:type="dxa" w:w="120"/>
+              <w:bottom w:type="dxa" w:w="100"/>
+              <w:right w:type="dxa" w:w="120"/>
+            </w:tcMar>
+          </w:tcPr>
+          <w:p>
+            <w:hyperlink w:history="1" r:id="rIdhdrvvwweh_iuoy_lqitr8">
+              <w:r>
+                <w:rPr>
+                  <w:rStyle w:val="Hyperlink"/>
+                  <w:sz w:val="18"/>
+                  <w:szCs w:val="18"/>
+                </w:rPr>
+                <w:t xml:space="preserve">Google: Learn how Gmail encrypts your emails</w:t>
+              </w:r>
+            </w:hyperlink>
+          </w:p>
+        </w:tc>
       </w:tr>
       <w:tr>
         <w:tc>
           <w:tcPr>
-            <w:tcW w:type="dxa" w:w="6854"/>
+            <w:tcW w:type="dxa" w:w="5242"/>
             <w:tcMar>
               <w:top w:type="dxa" w:w="100"/>
               <w:left w:type="dxa" w:w="120"/>
@@ -184,13 +230,13 @@
                 <w:bCs w:val="false"/>
                 <w:color w:val="000000"/>
               </w:rPr>
-              <w:t xml:space="preserve">A user must prove their identity with a password and, when 2-Step Verification is enabled, a second factor (one-time code or security key) before the account can be accessed.</w:t>
-            </w:r>
-          </w:p>
-        </w:tc>
-        <w:tc>
-          <w:tcPr>
-            <w:tcW w:type="dxa" w:w="3226"/>
+              <w:t xml:space="preserve">A user can require a second factor beyond their password before sign-in succeeds: "2-step verification adds an extra layer of security to your Google Account. In addition to your username and password, you'll enter a code that Google will send you via text or voice message upon signing in."</w:t>
+            </w:r>
+          </w:p>
+        </w:tc>
+        <w:tc>
+          <w:tcPr>
+            <w:tcW w:type="dxa" w:w="2016"/>
             <w:tcMar>
               <w:top w:type="dxa" w:w="100"/>
               <w:left w:type="dxa" w:w="120"/>
@@ -209,11 +255,34 @@
             </w:r>
           </w:p>
         </w:tc>
+        <w:tc>
+          <w:tcPr>
+            <w:tcW w:type="dxa" w:w="2822"/>
+            <w:tcMar>
+              <w:top w:type="dxa" w:w="100"/>
+              <w:left w:type="dxa" w:w="120"/>
+              <w:bottom w:type="dxa" w:w="100"/>
+              <w:right w:type="dxa" w:w="120"/>
+            </w:tcMar>
+          </w:tcPr>
+          <w:p>
+            <w:hyperlink w:history="1" r:id="rIdbooz-ipomiv12jjn3f7mj">
+              <w:r>
+                <w:rPr>
+                  <w:rStyle w:val="Hyperlink"/>
+                  <w:sz w:val="18"/>
+                  <w:szCs w:val="18"/>
+                </w:rPr>
+                <w:t xml:space="preserve">Google: How 2-step verification works</w:t>
+              </w:r>
+            </w:hyperlink>
+          </w:p>
+        </w:tc>
       </w:tr>
       <w:tr>
         <w:tc>
           <w:tcPr>
-            <w:tcW w:type="dxa" w:w="6854"/>
+            <w:tcW w:type="dxa" w:w="5242"/>
             <w:tcMar>
               <w:top w:type="dxa" w:w="100"/>
               <w:left w:type="dxa" w:w="120"/>
@@ -228,13 +297,13 @@
                 <w:bCs w:val="false"/>
                 <w:color w:val="000000"/>
               </w:rPr>
-              <w:t xml:space="preserve">A signed-in user may only view, forward, or delete messages in mailboxes they own or have been explicitly granted delegate access to; they must not be able to access another user's mailbox.</w:t>
-            </w:r>
-          </w:p>
-        </w:tc>
-        <w:tc>
-          <w:tcPr>
-            <w:tcW w:type="dxa" w:w="3226"/>
+              <w:t xml:space="preserve">Access to a mailbox can be granted to another user without giving up account ownership, and that access is limited: "Delegates can read, send, and delete messages for the delegated account, but they can't chat with anyone from the delegated account or change the password." A user without delegate access must not be able to reach another user's mailbox.</w:t>
+            </w:r>
+          </w:p>
+        </w:tc>
+        <w:tc>
+          <w:tcPr>
+            <w:tcW w:type="dxa" w:w="2016"/>
             <w:tcMar>
               <w:top w:type="dxa" w:w="100"/>
               <w:left w:type="dxa" w:w="120"/>
@@ -253,11 +322,34 @@
             </w:r>
           </w:p>
         </w:tc>
+        <w:tc>
+          <w:tcPr>
+            <w:tcW w:type="dxa" w:w="2822"/>
+            <w:tcMar>
+              <w:top w:type="dxa" w:w="100"/>
+              <w:left w:type="dxa" w:w="120"/>
+              <w:bottom w:type="dxa" w:w="100"/>
+              <w:right w:type="dxa" w:w="120"/>
+            </w:tcMar>
+          </w:tcPr>
+          <w:p>
+            <w:hyperlink w:history="1" r:id="rIdwvdjf71wfkzjzq1wchhvx">
+              <w:r>
+                <w:rPr>
+                  <w:rStyle w:val="Hyperlink"/>
+                  <w:sz w:val="18"/>
+                  <w:szCs w:val="18"/>
+                </w:rPr>
+                <w:t xml:space="preserve">Google: Delegate &amp; collaborate on email</w:t>
+              </w:r>
+            </w:hyperlink>
+          </w:p>
+        </w:tc>
       </w:tr>
       <w:tr>
         <w:tc>
           <w:tcPr>
-            <w:tcW w:type="dxa" w:w="6854"/>
+            <w:tcW w:type="dxa" w:w="5242"/>
             <w:tcMar>
               <w:top w:type="dxa" w:w="100"/>
               <w:left w:type="dxa" w:w="120"/>
@@ -272,13 +364,13 @@
                 <w:bCs w:val="false"/>
                 <w:color w:val="000000"/>
               </w:rPr>
-              <w:t xml:space="preserve">An authenticated session must expire after a period of inactivity and must be invalidated immediately when the user selects "Sign out," so a stolen or shared device cannot be used to access the account indefinitely.</w:t>
-            </w:r>
-          </w:p>
-        </w:tc>
-        <w:tc>
-          <w:tcPr>
-            <w:tcW w:type="dxa" w:w="3226"/>
+              <w:t xml:space="preserve">A user can view and end active sign-in sessions on specific devices: a "session is a period of time during which you're signed in to your Google Account from a browser, app, or service on the device," and from the devices list the user can select a session and "click Sign out" to invalidate it remotely (e.g., if a device is lost or shared).</w:t>
+            </w:r>
+          </w:p>
+        </w:tc>
+        <w:tc>
+          <w:tcPr>
+            <w:tcW w:type="dxa" w:w="2016"/>
             <w:tcMar>
               <w:top w:type="dxa" w:w="100"/>
               <w:left w:type="dxa" w:w="120"/>
@@ -297,11 +389,34 @@
             </w:r>
           </w:p>
         </w:tc>
+        <w:tc>
+          <w:tcPr>
+            <w:tcW w:type="dxa" w:w="2822"/>
+            <w:tcMar>
+              <w:top w:type="dxa" w:w="100"/>
+              <w:left w:type="dxa" w:w="120"/>
+              <w:bottom w:type="dxa" w:w="100"/>
+              <w:right w:type="dxa" w:w="120"/>
+            </w:tcMar>
+          </w:tcPr>
+          <w:p>
+            <w:hyperlink w:history="1" r:id="rIdj454m_os2nkg447iq0tlm">
+              <w:r>
+                <w:rPr>
+                  <w:rStyle w:val="Hyperlink"/>
+                  <w:sz w:val="18"/>
+                  <w:szCs w:val="18"/>
+                </w:rPr>
+                <w:t xml:space="preserve">Google: See devices with account access</w:t>
+              </w:r>
+            </w:hyperlink>
+          </w:p>
+        </w:tc>
       </w:tr>
       <w:tr>
         <w:tc>
           <w:tcPr>
-            <w:tcW w:type="dxa" w:w="6854"/>
+            <w:tcW w:type="dxa" w:w="5242"/>
             <w:tcMar>
               <w:top w:type="dxa" w:w="100"/>
               <w:left w:type="dxa" w:w="120"/>
@@ -316,13 +431,13 @@
                 <w:bCs w:val="false"/>
                 <w:color w:val="000000"/>
               </w:rPr>
-              <w:t xml:space="preserve">The system must log security-relevant events (sign-ins, password changes, granting of account access/delegation) with a timestamp and source IP address so suspicious activity can be traced back to a specific session.</w:t>
-            </w:r>
-          </w:p>
-        </w:tc>
-        <w:tc>
-          <w:tcPr>
-            <w:tcW w:type="dxa" w:w="3226"/>
+              <w:t xml:space="preserve">Sign-in and access events are recorded and reviewable so unauthorized activity can be traced: the account's security activity shows sign-in records, and if a user does "not recognize the activity on the page, like a location or access type, someone might have access to your account," prompting them to secure it.</w:t>
+            </w:r>
+          </w:p>
+        </w:tc>
+        <w:tc>
+          <w:tcPr>
+            <w:tcW w:type="dxa" w:w="2016"/>
             <w:tcMar>
               <w:top w:type="dxa" w:w="100"/>
               <w:left w:type="dxa" w:w="120"/>
@@ -341,11 +456,34 @@
             </w:r>
           </w:p>
         </w:tc>
+        <w:tc>
+          <w:tcPr>
+            <w:tcW w:type="dxa" w:w="2822"/>
+            <w:tcMar>
+              <w:top w:type="dxa" w:w="100"/>
+              <w:left w:type="dxa" w:w="120"/>
+              <w:bottom w:type="dxa" w:w="100"/>
+              <w:right w:type="dxa" w:w="120"/>
+            </w:tcMar>
+          </w:tcPr>
+          <w:p>
+            <w:hyperlink w:history="1" r:id="rIdjglyujuu-ee_hjkorktvq">
+              <w:r>
+                <w:rPr>
+                  <w:rStyle w:val="Hyperlink"/>
+                  <w:sz w:val="18"/>
+                  <w:szCs w:val="18"/>
+                </w:rPr>
+                <w:t xml:space="preserve">Google: Investigate suspicious activity on your account</w:t>
+              </w:r>
+            </w:hyperlink>
+          </w:p>
+        </w:tc>
       </w:tr>
       <w:tr>
         <w:tc>
           <w:tcPr>
-            <w:tcW w:type="dxa" w:w="6854"/>
+            <w:tcW w:type="dxa" w:w="5242"/>
             <w:tcMar>
               <w:top w:type="dxa" w:w="100"/>
               <w:left w:type="dxa" w:w="120"/>
@@ -360,13 +498,13 @@
                 <w:bCs w:val="false"/>
                 <w:color w:val="000000"/>
               </w:rPr>
-              <w:t xml:space="preserve">When a sign-in attempt fails, the system must return a generic error message rather than indicating specifically whether the username or the password was incorrect, so attackers cannot enumerate valid accounts.</w:t>
-            </w:r>
-          </w:p>
-        </w:tc>
-        <w:tc>
-          <w:tcPr>
-            <w:tcW w:type="dxa" w:w="3226"/>
+              <w:t xml:space="preserve">Organizations can require a minimum encryption standard for mail delivery rather than leaving it optional: Google Workspace admins can configure Gmail so that "messages sent to and from the specified domains are always sent over a secure TLS connection," and messages that cannot meet that requirement are rejected/quarantined instead of being silently sent in the clear.</w:t>
+            </w:r>
+          </w:p>
+        </w:tc>
+        <w:tc>
+          <w:tcPr>
+            <w:tcW w:type="dxa" w:w="2016"/>
             <w:tcMar>
               <w:top w:type="dxa" w:w="100"/>
               <w:left w:type="dxa" w:w="120"/>
@@ -381,8 +519,31 @@
                 <w:bCs w:val="false"/>
                 <w:color w:val="000000"/>
               </w:rPr>
-              <w:t xml:space="preserve">Error/Exceptions Management</w:t>
-            </w:r>
+              <w:t xml:space="preserve">Configuration Parameters Management</w:t>
+            </w:r>
+          </w:p>
+        </w:tc>
+        <w:tc>
+          <w:tcPr>
+            <w:tcW w:type="dxa" w:w="2822"/>
+            <w:tcMar>
+              <w:top w:type="dxa" w:w="100"/>
+              <w:left w:type="dxa" w:w="120"/>
+              <w:bottom w:type="dxa" w:w="100"/>
+              <w:right w:type="dxa" w:w="120"/>
+            </w:tcMar>
+          </w:tcPr>
+          <w:p>
+            <w:hyperlink w:history="1" r:id="rIdrxap5wpwugnrrioebxhtt">
+              <w:r>
+                <w:rPr>
+                  <w:rStyle w:val="Hyperlink"/>
+                  <w:sz w:val="18"/>
+                  <w:szCs w:val="18"/>
+                </w:rPr>
+                <w:t xml:space="preserve">Google: Send email over a secure TLS connection</w:t>
+              </w:r>
+            </w:hyperlink>
           </w:p>
         </w:tc>
       </w:tr>

</xml_diff>

<commit_message>
Swap Part 1 item 6 to a sourced Error/Exceptions Management requirement
Replaces the Configuration Parameters Management item with a
Google-sourced Error/Exceptions Management requirement: Google
detecting and blocking anomalous sign-in attempts and notifying the
account owner, per Google's official "Suspicious sign in prevented"
help article rather than a Workspace-admin-only feature.

Co-Authored-By: Claude Sonnet 5 <noreply@anthropic.com>
Claude-Session: https://claude.ai/code/session_01ATS6vWpy4e6bbX3UiMvZkF
</commit_message>
<xml_diff>
--- a/Homework2_Requirements.docx
+++ b/Homework2_Requirements.docx
@@ -199,7 +199,7 @@
             </w:tcMar>
           </w:tcPr>
           <w:p>
-            <w:hyperlink w:history="1" r:id="rIdhdrvvwweh_iuoy_lqitr8">
+            <w:hyperlink w:history="1" r:id="rIdg89ygowno1jbjtpueu7on">
               <w:r>
                 <w:rPr>
                   <w:rStyle w:val="Hyperlink"/>
@@ -266,7 +266,7 @@
             </w:tcMar>
           </w:tcPr>
           <w:p>
-            <w:hyperlink w:history="1" r:id="rIdbooz-ipomiv12jjn3f7mj">
+            <w:hyperlink w:history="1" r:id="rIdrxzwxobyi6iyjr0im181r">
               <w:r>
                 <w:rPr>
                   <w:rStyle w:val="Hyperlink"/>
@@ -333,7 +333,7 @@
             </w:tcMar>
           </w:tcPr>
           <w:p>
-            <w:hyperlink w:history="1" r:id="rIdwvdjf71wfkzjzq1wchhvx">
+            <w:hyperlink w:history="1" r:id="rIdl0zmwlf4hvkng8rejyc2j">
               <w:r>
                 <w:rPr>
                   <w:rStyle w:val="Hyperlink"/>
@@ -400,7 +400,7 @@
             </w:tcMar>
           </w:tcPr>
           <w:p>
-            <w:hyperlink w:history="1" r:id="rIdj454m_os2nkg447iq0tlm">
+            <w:hyperlink w:history="1" r:id="rId0ewalht3n2kkgshkdt958">
               <w:r>
                 <w:rPr>
                   <w:rStyle w:val="Hyperlink"/>
@@ -467,7 +467,7 @@
             </w:tcMar>
           </w:tcPr>
           <w:p>
-            <w:hyperlink w:history="1" r:id="rIdjglyujuu-ee_hjkorktvq">
+            <w:hyperlink w:history="1" r:id="rIdfhzyeckcsn2-8d8m_yz8i">
               <w:r>
                 <w:rPr>
                   <w:rStyle w:val="Hyperlink"/>
@@ -498,7 +498,7 @@
                 <w:bCs w:val="false"/>
                 <w:color w:val="000000"/>
               </w:rPr>
-              <w:t xml:space="preserve">Organizations can require a minimum encryption standard for mail delivery rather than leaving it optional: Google Workspace admins can configure Gmail so that "messages sent to and from the specified domains are always sent over a secure TLS connection," and messages that cannot meet that requirement are rejected/quarantined instead of being silently sent in the clear.</w:t>
+              <w:t xml:space="preserve">A sign-in attempt that looks anomalous must not be silently allowed or silently dropped: it must be detected, blocked, and reported to the account owner. Google's "Suspicious sign in prevented" notice describes exactly this behavior — when Google blocks a sign-in attempt it isn't confident is really the account owner (e.g., from an unfamiliar device or location), it emails the owner to explain what was blocked and why, rather than failing the request without explanation.</w:t>
             </w:r>
           </w:p>
         </w:tc>
@@ -519,7 +519,7 @@
                 <w:bCs w:val="false"/>
                 <w:color w:val="000000"/>
               </w:rPr>
-              <w:t xml:space="preserve">Configuration Parameters Management</w:t>
+              <w:t xml:space="preserve">Error/Exceptions Management</w:t>
             </w:r>
           </w:p>
         </w:tc>
@@ -534,14 +534,14 @@
             </w:tcMar>
           </w:tcPr>
           <w:p>
-            <w:hyperlink w:history="1" r:id="rIdrxap5wpwugnrrioebxhtt">
+            <w:hyperlink w:history="1" r:id="rIdbc4uuw-hdaj5vzwuyr-nv">
               <w:r>
                 <w:rPr>
                   <w:rStyle w:val="Hyperlink"/>
                   <w:sz w:val="18"/>
                   <w:szCs w:val="18"/>
                 </w:rPr>
-                <w:t xml:space="preserve">Google: Send email over a secure TLS connection</w:t>
+                <w:t xml:space="preserve">Google: 'Suspicious sign in prevented' email</w:t>
               </w:r>
             </w:hyperlink>
           </w:p>

</xml_diff>